<commit_message>
complete quiz 4 advance
</commit_message>
<xml_diff>
--- a/week1/AI_support/quiz4.docx
+++ b/week1/AI_support/quiz4.docx
@@ -38,7 +38,6 @@
       <w:pPr>
         <w:jc w:val="center"/>
         <w:rPr>
-          <w:rFonts w:hint="eastAsia"/>
           <w:b/>
           <w:bCs/>
         </w:rPr>
@@ -47,6 +46,7 @@
         <w:rPr>
           <w:b/>
           <w:bCs/>
+          <w:noProof/>
         </w:rPr>
         <w:drawing>
           <wp:inline distT="0" distB="0" distL="0" distR="0" wp14:anchorId="7E55E180" wp14:editId="6A6340A5">
@@ -88,6 +88,7 @@
         <w:rPr>
           <w:b/>
           <w:bCs/>
+          <w:noProof/>
         </w:rPr>
         <w:drawing>
           <wp:inline distT="0" distB="0" distL="0" distR="0" wp14:anchorId="5CC5656F" wp14:editId="642320F9">
@@ -129,6 +130,7 @@
         <w:rPr>
           <w:b/>
           <w:bCs/>
+          <w:noProof/>
         </w:rPr>
         <w:drawing>
           <wp:inline distT="0" distB="0" distL="0" distR="0" wp14:anchorId="6FB993EA" wp14:editId="10D57D45">
@@ -170,6 +172,7 @@
         <w:rPr>
           <w:b/>
           <w:bCs/>
+          <w:noProof/>
         </w:rPr>
         <w:drawing>
           <wp:inline distT="0" distB="0" distL="0" distR="0" wp14:anchorId="1A86E84E" wp14:editId="2E23026E">
@@ -211,6 +214,7 @@
         <w:rPr>
           <w:b/>
           <w:bCs/>
+          <w:noProof/>
         </w:rPr>
         <w:lastRenderedPageBreak/>
         <w:drawing>
@@ -253,6 +257,7 @@
         <w:rPr>
           <w:b/>
           <w:bCs/>
+          <w:noProof/>
         </w:rPr>
         <w:drawing>
           <wp:inline distT="0" distB="0" distL="0" distR="0" wp14:anchorId="56C4103D" wp14:editId="2CDD801E">
@@ -294,6 +299,7 @@
         <w:rPr>
           <w:b/>
           <w:bCs/>
+          <w:noProof/>
         </w:rPr>
         <w:drawing>
           <wp:inline distT="0" distB="0" distL="0" distR="0" wp14:anchorId="4B1CF1C8" wp14:editId="43EDBDB8">
@@ -320,6 +326,139 @@
                     <a:xfrm>
                       <a:off x="0" y="0"/>
                       <a:ext cx="4320000" cy="1398565"/>
+                    </a:xfrm>
+                    <a:prstGeom prst="rect">
+                      <a:avLst/>
+                    </a:prstGeom>
+                  </pic:spPr>
+                </pic:pic>
+              </a:graphicData>
+            </a:graphic>
+          </wp:inline>
+        </w:drawing>
+      </w:r>
+    </w:p>
+    <w:p>
+      <w:pPr>
+        <w:jc w:val="center"/>
+        <w:rPr>
+          <w:b/>
+          <w:bCs/>
+        </w:rPr>
+      </w:pPr>
+      <w:r>
+        <w:rPr>
+          <w:rFonts w:hint="eastAsia"/>
+          <w:b/>
+          <w:bCs/>
+        </w:rPr>
+        <w:t>Q</w:t>
+      </w:r>
+      <w:r>
+        <w:rPr>
+          <w:b/>
+          <w:bCs/>
+        </w:rPr>
+        <w:t>UIZ 4</w:t>
+      </w:r>
+      <w:r>
+        <w:rPr>
+          <w:rFonts w:hint="eastAsia"/>
+          <w:b/>
+          <w:bCs/>
+        </w:rPr>
+        <w:t xml:space="preserve"> </w:t>
+      </w:r>
+      <w:r>
+        <w:rPr>
+          <w:rFonts w:hint="eastAsia"/>
+          <w:b/>
+          <w:bCs/>
+        </w:rPr>
+        <w:t>進階</w:t>
+      </w:r>
+    </w:p>
+    <w:p>
+      <w:pPr>
+        <w:jc w:val="center"/>
+        <w:rPr>
+          <w:rFonts w:hint="eastAsia"/>
+          <w:b/>
+          <w:bCs/>
+        </w:rPr>
+      </w:pPr>
+      <w:r>
+        <w:rPr>
+          <w:b/>
+          <w:bCs/>
+        </w:rPr>
+        <w:drawing>
+          <wp:inline distT="0" distB="0" distL="0" distR="0" wp14:anchorId="56B54170" wp14:editId="5B32FB48">
+            <wp:extent cx="4320000" cy="2497029"/>
+            <wp:effectExtent l="0" t="0" r="4445" b="0"/>
+            <wp:docPr id="6" name="圖片 6"/>
+            <wp:cNvGraphicFramePr>
+              <a:graphicFrameLocks xmlns:a="http://schemas.openxmlformats.org/drawingml/2006/main" noChangeAspect="1"/>
+            </wp:cNvGraphicFramePr>
+            <a:graphic xmlns:a="http://schemas.openxmlformats.org/drawingml/2006/main">
+              <a:graphicData uri="http://schemas.openxmlformats.org/drawingml/2006/picture">
+                <pic:pic xmlns:pic="http://schemas.openxmlformats.org/drawingml/2006/picture">
+                  <pic:nvPicPr>
+                    <pic:cNvPr id="1" name=""/>
+                    <pic:cNvPicPr/>
+                  </pic:nvPicPr>
+                  <pic:blipFill>
+                    <a:blip r:embed="rId11"/>
+                    <a:stretch>
+                      <a:fillRect/>
+                    </a:stretch>
+                  </pic:blipFill>
+                  <pic:spPr>
+                    <a:xfrm>
+                      <a:off x="0" y="0"/>
+                      <a:ext cx="4320000" cy="2497029"/>
+                    </a:xfrm>
+                    <a:prstGeom prst="rect">
+                      <a:avLst/>
+                    </a:prstGeom>
+                  </pic:spPr>
+                </pic:pic>
+              </a:graphicData>
+            </a:graphic>
+          </wp:inline>
+        </w:drawing>
+      </w:r>
+      <w:r>
+        <w:rPr>
+          <w:b/>
+          <w:bCs/>
+        </w:rPr>
+        <w:lastRenderedPageBreak/>
+        <w:drawing>
+          <wp:inline distT="0" distB="0" distL="0" distR="0" wp14:anchorId="2CBD9BE5" wp14:editId="1FD606E3">
+            <wp:extent cx="4320000" cy="1342914"/>
+            <wp:effectExtent l="0" t="0" r="4445" b="0"/>
+            <wp:docPr id="7" name="圖片 7"/>
+            <wp:cNvGraphicFramePr>
+              <a:graphicFrameLocks xmlns:a="http://schemas.openxmlformats.org/drawingml/2006/main" noChangeAspect="1"/>
+            </wp:cNvGraphicFramePr>
+            <a:graphic xmlns:a="http://schemas.openxmlformats.org/drawingml/2006/main">
+              <a:graphicData uri="http://schemas.openxmlformats.org/drawingml/2006/picture">
+                <pic:pic xmlns:pic="http://schemas.openxmlformats.org/drawingml/2006/picture">
+                  <pic:nvPicPr>
+                    <pic:cNvPr id="1" name=""/>
+                    <pic:cNvPicPr/>
+                  </pic:nvPicPr>
+                  <pic:blipFill>
+                    <a:blip r:embed="rId12"/>
+                    <a:stretch>
+                      <a:fillRect/>
+                    </a:stretch>
+                  </pic:blipFill>
+                  <pic:spPr>
+                    <a:xfrm>
+                      <a:off x="0" y="0"/>
+                      <a:ext cx="4320000" cy="1342914"/>
                     </a:xfrm>
                     <a:prstGeom prst="rect">
                       <a:avLst/>

</xml_diff>